<commit_message>
docs: concrete founder equity split in cofounder agreements
- Peter Mbugua (Cofounder & CEO — Engineering): 21%, reflecting pre-founding
  build of the entire platform
- Each of the four seats (Legal & Research, Marketing & Sales, Security,
  Finance & Strategy): 19%
- Remaining 3% held as unallocated reserve for future hires/option pool,
  releasable only by unanimous founder consent
- Every agreement now carries the full founding ownership table; the
  overview consolidates all five seats; signatory named as CEO
- Word documents regenerated from updated markdown
</commit_message>
<xml_diff>
--- a/docs/cofounders/Bud_Cofounder_Agreement_Finance_and_Strategy.docx
+++ b/docs/cofounders/Bud_Cofounder_Agreement_Finance_and_Strategy.docx
@@ -129,7 +129,13 @@
           <w:p>
             <w:r/>
             <w:r>
-              <w:t>[●]% of fully-diluted share capital at grant, subject to the vesting terms in Annex A</w:t>
+              <w:rPr>
+                <w:b/>
+              </w:rPr>
+              <w:t>19%</w:t>
+            </w:r>
+            <w:r>
+              <w:t xml:space="preserve"> of fully-diluted share capital at grant, subject to the vesting terms in Annex A</w:t>
             </w:r>
           </w:p>
         </w:tc>
@@ -236,6 +242,324 @@
           <w:bottom w:val="single" w:sz="6" w:color="BBBBBB"/>
         </w:pBdr>
       </w:pPr>
+    </w:p>
+    <w:p>
+      <w:pPr>
+        <w:pStyle w:val="Heading2"/>
+      </w:pPr>
+      <w:r>
+        <w:rPr>
+          <w:color w:val="1A1A1A"/>
+        </w:rPr>
+        <w:t>Founding team &amp; ownership</w:t>
+      </w:r>
+    </w:p>
+    <w:p>
+      <w:r>
+        <w:t>The founding team holds 97% of BuddyUp Ltd. at incorporation, split as follows:</w:t>
+      </w:r>
+    </w:p>
+    <w:tbl>
+      <w:tblPr>
+        <w:tblStyle w:val="LightGrid-Accent1"/>
+        <w:tblW w:type="auto" w:w="0"/>
+        <w:jc w:val="left"/>
+        <w:tblLook w:firstColumn="1" w:firstRow="1" w:lastColumn="0" w:lastRow="0" w:noHBand="0" w:noVBand="1" w:val="04A0"/>
+      </w:tblPr>
+      <w:tblGrid>
+        <w:gridCol w:w="3216"/>
+        <w:gridCol w:w="3216"/>
+        <w:gridCol w:w="3216"/>
+      </w:tblGrid>
+      <w:tr>
+        <w:tc>
+          <w:tcPr>
+            <w:tcW w:type="dxa" w:w="3216"/>
+          </w:tcPr>
+          <w:p>
+            <w:r>
+              <w:rPr>
+                <w:b/>
+              </w:rPr>
+            </w:r>
+            <w:r>
+              <w:rPr>
+                <w:b/>
+              </w:rPr>
+              <w:t>Seat</w:t>
+            </w:r>
+          </w:p>
+        </w:tc>
+        <w:tc>
+          <w:tcPr>
+            <w:tcW w:type="dxa" w:w="3216"/>
+          </w:tcPr>
+          <w:p>
+            <w:r>
+              <w:rPr>
+                <w:b/>
+              </w:rPr>
+            </w:r>
+            <w:r>
+              <w:rPr>
+                <w:b/>
+              </w:rPr>
+              <w:t>Holder</w:t>
+            </w:r>
+          </w:p>
+        </w:tc>
+        <w:tc>
+          <w:tcPr>
+            <w:tcW w:type="dxa" w:w="3216"/>
+          </w:tcPr>
+          <w:p>
+            <w:r>
+              <w:rPr>
+                <w:b/>
+              </w:rPr>
+            </w:r>
+            <w:r>
+              <w:rPr>
+                <w:b/>
+              </w:rPr>
+              <w:t>Equity</w:t>
+            </w:r>
+          </w:p>
+        </w:tc>
+      </w:tr>
+      <w:tr>
+        <w:tc>
+          <w:tcPr>
+            <w:tcW w:type="dxa" w:w="3216"/>
+          </w:tcPr>
+          <w:p>
+            <w:r/>
+            <w:r>
+              <w:t>Cofounder &amp; CEO — Engineering</w:t>
+            </w:r>
+          </w:p>
+        </w:tc>
+        <w:tc>
+          <w:tcPr>
+            <w:tcW w:type="dxa" w:w="3216"/>
+          </w:tcPr>
+          <w:p>
+            <w:r/>
+            <w:r>
+              <w:t>Peter Mbugua</w:t>
+            </w:r>
+          </w:p>
+        </w:tc>
+        <w:tc>
+          <w:tcPr>
+            <w:tcW w:type="dxa" w:w="3216"/>
+          </w:tcPr>
+          <w:p>
+            <w:r/>
+            <w:r>
+              <w:rPr>
+                <w:b/>
+              </w:rPr>
+              <w:t>21%</w:t>
+            </w:r>
+          </w:p>
+        </w:tc>
+      </w:tr>
+      <w:tr>
+        <w:tc>
+          <w:tcPr>
+            <w:tcW w:type="dxa" w:w="3216"/>
+          </w:tcPr>
+          <w:p>
+            <w:r/>
+            <w:r>
+              <w:t>Cofounder — Finance, Strategy &amp; Controller</w:t>
+            </w:r>
+          </w:p>
+        </w:tc>
+        <w:tc>
+          <w:tcPr>
+            <w:tcW w:type="dxa" w:w="3216"/>
+          </w:tcPr>
+          <w:p>
+            <w:r/>
+            <w:r>
+              <w:rPr>
+                <w:i/>
+              </w:rPr>
+              <w:t>(this offer — [Full legal name])</w:t>
+            </w:r>
+          </w:p>
+        </w:tc>
+        <w:tc>
+          <w:tcPr>
+            <w:tcW w:type="dxa" w:w="3216"/>
+          </w:tcPr>
+          <w:p>
+            <w:r/>
+            <w:r>
+              <w:rPr>
+                <w:b/>
+              </w:rPr>
+              <w:t>19%</w:t>
+            </w:r>
+          </w:p>
+        </w:tc>
+      </w:tr>
+      <w:tr>
+        <w:tc>
+          <w:tcPr>
+            <w:tcW w:type="dxa" w:w="3216"/>
+          </w:tcPr>
+          <w:p>
+            <w:r/>
+            <w:r>
+              <w:t>Cofounder — Marketing, Sales &amp; Partnerships</w:t>
+            </w:r>
+          </w:p>
+        </w:tc>
+        <w:tc>
+          <w:tcPr>
+            <w:tcW w:type="dxa" w:w="3216"/>
+          </w:tcPr>
+          <w:p>
+            <w:r/>
+            <w:r>
+              <w:t>[●]</w:t>
+            </w:r>
+          </w:p>
+        </w:tc>
+        <w:tc>
+          <w:tcPr>
+            <w:tcW w:type="dxa" w:w="3216"/>
+          </w:tcPr>
+          <w:p>
+            <w:r/>
+            <w:r>
+              <w:t>19%</w:t>
+            </w:r>
+          </w:p>
+        </w:tc>
+      </w:tr>
+      <w:tr>
+        <w:tc>
+          <w:tcPr>
+            <w:tcW w:type="dxa" w:w="3216"/>
+          </w:tcPr>
+          <w:p>
+            <w:r/>
+            <w:r>
+              <w:t>Cofounder — Security Engineering &amp; Trust</w:t>
+            </w:r>
+          </w:p>
+        </w:tc>
+        <w:tc>
+          <w:tcPr>
+            <w:tcW w:type="dxa" w:w="3216"/>
+          </w:tcPr>
+          <w:p>
+            <w:r/>
+            <w:r>
+              <w:t>[●]</w:t>
+            </w:r>
+          </w:p>
+        </w:tc>
+        <w:tc>
+          <w:tcPr>
+            <w:tcW w:type="dxa" w:w="3216"/>
+          </w:tcPr>
+          <w:p>
+            <w:r/>
+            <w:r>
+              <w:t>19%</w:t>
+            </w:r>
+          </w:p>
+        </w:tc>
+      </w:tr>
+      <w:tr>
+        <w:tc>
+          <w:tcPr>
+            <w:tcW w:type="dxa" w:w="3216"/>
+          </w:tcPr>
+          <w:p>
+            <w:r/>
+            <w:r>
+              <w:t>Unallocated reserve (future hires / option pool)</w:t>
+            </w:r>
+          </w:p>
+        </w:tc>
+        <w:tc>
+          <w:tcPr>
+            <w:tcW w:type="dxa" w:w="3216"/>
+          </w:tcPr>
+          <w:p>
+            <w:r/>
+            <w:r>
+              <w:t>held for unanimous founder decision</w:t>
+            </w:r>
+          </w:p>
+        </w:tc>
+        <w:tc>
+          <w:tcPr>
+            <w:tcW w:type="dxa" w:w="3216"/>
+          </w:tcPr>
+          <w:p>
+            <w:r/>
+            <w:r>
+              <w:t>3%</w:t>
+            </w:r>
+          </w:p>
+        </w:tc>
+      </w:tr>
+      <w:tr>
+        <w:tc>
+          <w:tcPr>
+            <w:tcW w:type="dxa" w:w="3216"/>
+          </w:tcPr>
+          <w:p>
+            <w:r/>
+            <w:r>
+              <w:rPr>
+                <w:b/>
+              </w:rPr>
+              <w:t>Total</w:t>
+            </w:r>
+          </w:p>
+        </w:tc>
+        <w:tc>
+          <w:tcPr>
+            <w:tcW w:type="dxa" w:w="3216"/>
+          </w:tcPr>
+          <w:p>
+            <w:r/>
+          </w:p>
+        </w:tc>
+        <w:tc>
+          <w:tcPr>
+            <w:tcW w:type="dxa" w:w="3216"/>
+          </w:tcPr>
+          <w:p>
+            <w:r/>
+            <w:r>
+              <w:rPr>
+                <w:b/>
+              </w:rPr>
+              <w:t>100%</w:t>
+            </w:r>
+          </w:p>
+        </w:tc>
+      </w:tr>
+    </w:tbl>
+    <w:p/>
+    <w:p>
+      <w:r>
+        <w:t>All founder equity vests on identical terms (Annex A). No seat carries special</w:t>
+      </w:r>
+    </w:p>
+    <w:p>
+      <w:r>
+        <w:t>voting or economic rights beyond the shareholders' agreement.</w:t>
+      </w:r>
     </w:p>
     <w:p>
       <w:pPr>
@@ -612,7 +936,16 @@
     </w:p>
     <w:p>
       <w:r>
-        <w:t>Grant [●]% fully-diluted at grant; vesting and leaver terms per Annex A.</w:t>
+        <w:t xml:space="preserve">Grant of </w:t>
+      </w:r>
+      <w:r>
+        <w:rPr>
+          <w:b/>
+        </w:rPr>
+        <w:t>19%</w:t>
+      </w:r>
+      <w:r>
+        <w:t xml:space="preserve"> fully-diluted at grant; vesting and leaver terms per Annex A.</w:t>
       </w:r>
     </w:p>
     <w:p>
@@ -839,7 +1172,7 @@
           <w:p>
             <w:r/>
             <w:r>
-              <w:t>Name: [●]</w:t>
+              <w:t>Name: Peter Mbugua</w:t>
             </w:r>
           </w:p>
         </w:tc>
@@ -863,7 +1196,7 @@
           <w:p>
             <w:r/>
             <w:r>
-              <w:t>Title: Founder/CEO</w:t>
+              <w:t>Title: Cofounder &amp; CEO</w:t>
             </w:r>
           </w:p>
         </w:tc>
@@ -937,7 +1270,12 @@
         <w:pStyle w:val="ListNumber"/>
       </w:pPr>
       <w:r>
-        <w:t>Grant of [●]% fully-diluted at grant, recorded in the share register.</w:t>
+        <w:t>Grant of 19% of the fully-diluted capital of BuddyUp Ltd. as at the start date,</w:t>
+      </w:r>
+    </w:p>
+    <w:p>
+      <w:r>
+        <w:t>recorded in the share register.</w:t>
       </w:r>
     </w:p>
     <w:p>

</xml_diff>

<commit_message>
docs: cofounder agreements (equal equity, part-time, tie-break), FSHA draft
- all four agreements: 16% equal seats, 20% reserve, part-time 10h/week,
  outcome-based commitment, declaration of interests, flexible 90-day
  measurement, D&O protections, counsel costs as opex, FMV bad-leaver
  buy-back, 100% double-trigger acceleration
- README: YC-informed decision-making framework + CEO casting vote
- founders-shareholders-agreement-draft.md + regenerated .docx exports
- OPERATIONS.md deployment topology (Railway per-service Docker)
</commit_message>
<xml_diff>
--- a/docs/cofounders/Bud_Cofounder_Agreement_Finance_and_Strategy.docx
+++ b/docs/cofounders/Bud_Cofounder_Agreement_Finance_and_Strategy.docx
@@ -4,60 +4,46 @@
   <w:body>
     <w:p>
       <w:pPr>
-        <w:pStyle w:val="Title"/>
-        <w:jc w:val="center"/>
+        <w:pStyle w:val="Heading1"/>
       </w:pPr>
       <w:r>
-        <w:rPr>
-          <w:color w:val="008A5C"/>
-        </w:rPr>
         <w:t>Cofounder Agreement — Finance &amp; Strategy</w:t>
-      </w:r>
-    </w:p>
-    <w:p>
-      <w:r>
-        <w:rPr>
-          <w:b/>
-        </w:rPr>
-        <w:t>BuddyUp Ltd.</w:t>
-      </w:r>
-      <w:r>
-        <w:t xml:space="preserve"> — Founding Team Heads of Terms (pre-shareholders' agreement)</w:t>
       </w:r>
     </w:p>
     <w:tbl>
       <w:tblPr>
-        <w:tblStyle w:val="LightGrid-Accent1"/>
+        <w:tblStyle w:val="TableGrid"/>
         <w:tblW w:type="auto" w:w="0"/>
-        <w:jc w:val="left"/>
         <w:tblLook w:firstColumn="1" w:firstRow="1" w:lastColumn="0" w:lastRow="0" w:noHBand="0" w:noVBand="1" w:val="04A0"/>
       </w:tblPr>
       <w:tblGrid>
-        <w:gridCol w:w="4824"/>
-        <w:gridCol w:w="4824"/>
+        <w:gridCol w:w="4320"/>
+        <w:gridCol w:w="4320"/>
       </w:tblGrid>
       <w:tr>
         <w:tc>
           <w:tcPr>
-            <w:tcW w:type="dxa" w:w="4824"/>
+            <w:tcW w:type="dxa" w:w="4320"/>
           </w:tcPr>
           <w:p>
             <w:r>
               <w:rPr>
                 <w:b/>
               </w:rPr>
+              <w:t>Document owner</w:t>
             </w:r>
           </w:p>
         </w:tc>
         <w:tc>
           <w:tcPr>
-            <w:tcW w:type="dxa" w:w="4824"/>
+            <w:tcW w:type="dxa" w:w="4320"/>
           </w:tcPr>
           <w:p>
             <w:r>
               <w:rPr>
                 <w:b/>
               </w:rPr>
+              <w:t>Review date</w:t>
             </w:r>
           </w:p>
         </w:tc>
@@ -65,10 +51,68 @@
       <w:tr>
         <w:tc>
           <w:tcPr>
-            <w:tcW w:type="dxa" w:w="4824"/>
+            <w:tcW w:type="dxa" w:w="4320"/>
           </w:tcPr>
           <w:p>
-            <w:r/>
+            <w:r>
+              <w:t>Peter Mbugua (CEO); incoming Finance cofounder on appointment</w:t>
+            </w:r>
+          </w:p>
+        </w:tc>
+        <w:tc>
+          <w:tcPr>
+            <w:tcW w:type="dxa" w:w="4320"/>
+          </w:tcPr>
+          <w:p>
+            <w:r>
+              <w:t>2026-09-30</w:t>
+            </w:r>
+          </w:p>
+        </w:tc>
+      </w:tr>
+    </w:tbl>
+    <w:p/>
+    <w:p>
+      <w:r>
+        <w:rPr>
+          <w:b/>
+        </w:rPr>
+        <w:t>BuddyUp Ltd.</w:t>
+      </w:r>
+      <w:r>
+        <w:t xml:space="preserve"> — Founding Team Heads of Terms (pre-shareholders' agreement)</w:t>
+      </w:r>
+    </w:p>
+    <w:tbl>
+      <w:tblPr>
+        <w:tblStyle w:val="TableGrid"/>
+        <w:tblW w:type="auto" w:w="0"/>
+        <w:tblLook w:firstColumn="1" w:firstRow="1" w:lastColumn="0" w:lastRow="0" w:noHBand="0" w:noVBand="1" w:val="04A0"/>
+      </w:tblPr>
+      <w:tblGrid>
+        <w:gridCol w:w="4320"/>
+        <w:gridCol w:w="4320"/>
+      </w:tblGrid>
+      <w:tr>
+        <w:tc>
+          <w:tcPr>
+            <w:tcW w:type="dxa" w:w="4320"/>
+          </w:tcPr>
+          <w:p/>
+        </w:tc>
+        <w:tc>
+          <w:tcPr>
+            <w:tcW w:type="dxa" w:w="4320"/>
+          </w:tcPr>
+          <w:p/>
+        </w:tc>
+      </w:tr>
+      <w:tr>
+        <w:tc>
+          <w:tcPr>
+            <w:tcW w:type="dxa" w:w="4320"/>
+          </w:tcPr>
+          <w:p>
             <w:r>
               <w:t>Candidate</w:t>
             </w:r>
@@ -76,10 +120,9 @@
         </w:tc>
         <w:tc>
           <w:tcPr>
-            <w:tcW w:type="dxa" w:w="4824"/>
+            <w:tcW w:type="dxa" w:w="4320"/>
           </w:tcPr>
           <w:p>
-            <w:r/>
             <w:r>
               <w:t>[Full legal name], ID/Passport No. [●]</w:t>
             </w:r>
@@ -89,10 +132,9 @@
       <w:tr>
         <w:tc>
           <w:tcPr>
-            <w:tcW w:type="dxa" w:w="4824"/>
+            <w:tcW w:type="dxa" w:w="4320"/>
           </w:tcPr>
           <w:p>
-            <w:r/>
             <w:r>
               <w:t>Role</w:t>
             </w:r>
@@ -100,10 +142,9 @@
         </w:tc>
         <w:tc>
           <w:tcPr>
-            <w:tcW w:type="dxa" w:w="4824"/>
+            <w:tcW w:type="dxa" w:w="4320"/>
           </w:tcPr>
           <w:p>
-            <w:r/>
             <w:r>
               <w:t>Cofounder — Finance, Strategy &amp; Controller</w:t>
             </w:r>
@@ -113,10 +154,9 @@
       <w:tr>
         <w:tc>
           <w:tcPr>
-            <w:tcW w:type="dxa" w:w="4824"/>
+            <w:tcW w:type="dxa" w:w="4320"/>
           </w:tcPr>
           <w:p>
-            <w:r/>
             <w:r>
               <w:t>Proposed equity</w:t>
             </w:r>
@@ -124,15 +164,14 @@
         </w:tc>
         <w:tc>
           <w:tcPr>
-            <w:tcW w:type="dxa" w:w="4824"/>
+            <w:tcW w:type="dxa" w:w="4320"/>
           </w:tcPr>
           <w:p>
-            <w:r/>
             <w:r>
               <w:rPr>
                 <w:b/>
               </w:rPr>
-              <w:t>19%</w:t>
+              <w:t>16%</w:t>
             </w:r>
             <w:r>
               <w:t xml:space="preserve"> of fully-diluted share capital at grant, subject to the vesting terms in Annex A</w:t>
@@ -143,10 +182,40 @@
       <w:tr>
         <w:tc>
           <w:tcPr>
-            <w:tcW w:type="dxa" w:w="4824"/>
+            <w:tcW w:type="dxa" w:w="4320"/>
           </w:tcPr>
           <w:p>
-            <w:r/>
+            <w:r>
+              <w:t>Commitment</w:t>
+            </w:r>
+          </w:p>
+        </w:tc>
+        <w:tc>
+          <w:tcPr>
+            <w:tcW w:type="dxa" w:w="4320"/>
+          </w:tcPr>
+          <w:p>
+            <w:r>
+              <w:t xml:space="preserve">Part-time — minimum </w:t>
+            </w:r>
+            <w:r>
+              <w:rPr>
+                <w:b/>
+              </w:rPr>
+              <w:t>10 hours per week</w:t>
+            </w:r>
+            <w:r>
+              <w:t xml:space="preserve"> (Clause 4)</w:t>
+            </w:r>
+          </w:p>
+        </w:tc>
+      </w:tr>
+      <w:tr>
+        <w:tc>
+          <w:tcPr>
+            <w:tcW w:type="dxa" w:w="4320"/>
+          </w:tcPr>
+          <w:p>
             <w:r>
               <w:t>Vesting</w:t>
             </w:r>
@@ -154,10 +223,9 @@
         </w:tc>
         <w:tc>
           <w:tcPr>
-            <w:tcW w:type="dxa" w:w="4824"/>
+            <w:tcW w:type="dxa" w:w="4320"/>
           </w:tcPr>
           <w:p>
-            <w:r/>
             <w:r>
               <w:t>4 years monthly, 1-year cliff (Annex A)</w:t>
             </w:r>
@@ -167,10 +235,9 @@
       <w:tr>
         <w:tc>
           <w:tcPr>
-            <w:tcW w:type="dxa" w:w="4824"/>
+            <w:tcW w:type="dxa" w:w="4320"/>
           </w:tcPr>
           <w:p>
-            <w:r/>
             <w:r>
               <w:t>Start date</w:t>
             </w:r>
@@ -178,10 +245,9 @@
         </w:tc>
         <w:tc>
           <w:tcPr>
-            <w:tcW w:type="dxa" w:w="4824"/>
+            <w:tcW w:type="dxa" w:w="4320"/>
           </w:tcPr>
           <w:p>
-            <w:r/>
             <w:r>
               <w:t>[●]</w:t>
             </w:r>
@@ -191,10 +257,9 @@
       <w:tr>
         <w:tc>
           <w:tcPr>
-            <w:tcW w:type="dxa" w:w="4824"/>
+            <w:tcW w:type="dxa" w:w="4320"/>
           </w:tcPr>
           <w:p>
-            <w:r/>
             <w:r>
               <w:t>Reporting line</w:t>
             </w:r>
@@ -202,10 +267,9 @@
         </w:tc>
         <w:tc>
           <w:tcPr>
-            <w:tcW w:type="dxa" w:w="4824"/>
+            <w:tcW w:type="dxa" w:w="4320"/>
           </w:tcPr>
           <w:p>
-            <w:r/>
             <w:r>
               <w:t>CEO / Board of BuddyUp Ltd.</w:t>
             </w:r>
@@ -216,72 +280,94 @@
     <w:p/>
     <w:p>
       <w:pPr>
-        <w:spacing w:after="160"/>
-        <w:ind w:left="360"/>
+        <w:ind w:left="432"/>
       </w:pPr>
       <w:r>
         <w:rPr>
           <w:b/>
-          <w:i/>
-          <w:color w:val="444444"/>
         </w:rPr>
         <w:t>Status:</w:t>
       </w:r>
       <w:r>
-        <w:rPr>
-          <w:i/>
-          <w:color w:val="444444"/>
-        </w:rPr>
-        <w:t xml:space="preserve"> This is an invitation to join the founding team and a summary of proposed terms. It is not a shareholders' agreement, not an employment contract, and not legal advice. It becomes binding only when superseded by the executed Founders' Shareholders' Agreement (Kenyan law) that all founders will sign together.</w:t>
+        <w:t xml:space="preserve"> This is an invitation to join the founding team and a summary of proposed</w:t>
       </w:r>
     </w:p>
     <w:p>
       <w:pPr>
-        <w:spacing w:before="80"/>
-        <w:pBdr>
-          <w:bottom w:val="single" w:sz="6" w:color="BBBBBB"/>
-        </w:pBdr>
+        <w:ind w:left="432"/>
       </w:pPr>
+      <w:r>
+        <w:t>terms. It is not a shareholders' agreement, not an employment contract, and not legal</w:t>
+      </w:r>
+    </w:p>
+    <w:p>
+      <w:pPr>
+        <w:ind w:left="432"/>
+      </w:pPr>
+      <w:r>
+        <w:t>advice. It becomes binding only when superseded by the executed Founders'</w:t>
+      </w:r>
+    </w:p>
+    <w:p>
+      <w:pPr>
+        <w:ind w:left="432"/>
+      </w:pPr>
+      <w:r>
+        <w:t>Shareholders' Agreement (Kenyan law) that all founders will sign together.</w:t>
+      </w:r>
     </w:p>
     <w:p>
       <w:pPr>
         <w:pStyle w:val="Heading2"/>
       </w:pPr>
       <w:r>
+        <w:t>Founding team &amp; ownership</w:t>
+      </w:r>
+      <w:r>
+        <w:br/>
+      </w:r>
+      <w:r>
+        <w:t>The founding team holds 80% of BuddyUp Ltd. at incorporation, with a **20%</w:t>
+      </w:r>
+      <w:r>
+        <w:br/>
+      </w:r>
+      <w:r>
+        <w:t>unallocated reserve** for future hires and the option pool. All five founder</w:t>
+      </w:r>
+      <w:r>
+        <w:br/>
+      </w:r>
+      <w:r>
+        <w:t xml:space="preserve">seats hold an </w:t>
+      </w:r>
+      <w:r>
         <w:rPr>
-          <w:color w:val="1A1A1A"/>
+          <w:b/>
         </w:rPr>
-        <w:t>Founding team &amp; ownership</w:t>
-      </w:r>
-    </w:p>
-    <w:p>
-      <w:r>
-        <w:t>The founding team holds 97% of BuddyUp Ltd. at incorporation, split as follows:</w:t>
+        <w:t>equal 16%</w:t>
+      </w:r>
+      <w:r>
+        <w:t xml:space="preserve"> — the YC-recommended structure — split as follows:</w:t>
       </w:r>
     </w:p>
     <w:tbl>
       <w:tblPr>
-        <w:tblStyle w:val="LightGrid-Accent1"/>
+        <w:tblStyle w:val="TableGrid"/>
         <w:tblW w:type="auto" w:w="0"/>
-        <w:jc w:val="left"/>
         <w:tblLook w:firstColumn="1" w:firstRow="1" w:lastColumn="0" w:lastRow="0" w:noHBand="0" w:noVBand="1" w:val="04A0"/>
       </w:tblPr>
       <w:tblGrid>
-        <w:gridCol w:w="3216"/>
-        <w:gridCol w:w="3216"/>
-        <w:gridCol w:w="3216"/>
+        <w:gridCol w:w="2880"/>
+        <w:gridCol w:w="2880"/>
+        <w:gridCol w:w="2880"/>
       </w:tblGrid>
       <w:tr>
         <w:tc>
           <w:tcPr>
-            <w:tcW w:type="dxa" w:w="3216"/>
+            <w:tcW w:type="dxa" w:w="2880"/>
           </w:tcPr>
           <w:p>
-            <w:r>
-              <w:rPr>
-                <w:b/>
-              </w:rPr>
-            </w:r>
             <w:r>
               <w:rPr>
                 <w:b/>
@@ -292,14 +378,9 @@
         </w:tc>
         <w:tc>
           <w:tcPr>
-            <w:tcW w:type="dxa" w:w="3216"/>
+            <w:tcW w:type="dxa" w:w="2880"/>
           </w:tcPr>
           <w:p>
-            <w:r>
-              <w:rPr>
-                <w:b/>
-              </w:rPr>
-            </w:r>
             <w:r>
               <w:rPr>
                 <w:b/>
@@ -310,14 +391,9 @@
         </w:tc>
         <w:tc>
           <w:tcPr>
-            <w:tcW w:type="dxa" w:w="3216"/>
+            <w:tcW w:type="dxa" w:w="2880"/>
           </w:tcPr>
           <w:p>
-            <w:r>
-              <w:rPr>
-                <w:b/>
-              </w:rPr>
-            </w:r>
             <w:r>
               <w:rPr>
                 <w:b/>
@@ -330,10 +406,9 @@
       <w:tr>
         <w:tc>
           <w:tcPr>
-            <w:tcW w:type="dxa" w:w="3216"/>
+            <w:tcW w:type="dxa" w:w="2880"/>
           </w:tcPr>
           <w:p>
-            <w:r/>
             <w:r>
               <w:t>Cofounder &amp; CEO — Engineering</w:t>
             </w:r>
@@ -341,10 +416,9 @@
         </w:tc>
         <w:tc>
           <w:tcPr>
-            <w:tcW w:type="dxa" w:w="3216"/>
+            <w:tcW w:type="dxa" w:w="2880"/>
           </w:tcPr>
           <w:p>
-            <w:r/>
             <w:r>
               <w:t>Peter Mbugua</w:t>
             </w:r>
@@ -352,15 +426,14 @@
         </w:tc>
         <w:tc>
           <w:tcPr>
-            <w:tcW w:type="dxa" w:w="3216"/>
+            <w:tcW w:type="dxa" w:w="2880"/>
           </w:tcPr>
           <w:p>
-            <w:r/>
             <w:r>
               <w:rPr>
                 <w:b/>
               </w:rPr>
-              <w:t>21%</w:t>
+              <w:t>16%</w:t>
             </w:r>
           </w:p>
         </w:tc>
@@ -368,10 +441,9 @@
       <w:tr>
         <w:tc>
           <w:tcPr>
-            <w:tcW w:type="dxa" w:w="3216"/>
+            <w:tcW w:type="dxa" w:w="2880"/>
           </w:tcPr>
           <w:p>
-            <w:r/>
             <w:r>
               <w:t>Cofounder — Finance, Strategy &amp; Controller</w:t>
             </w:r>
@@ -379,10 +451,9 @@
         </w:tc>
         <w:tc>
           <w:tcPr>
-            <w:tcW w:type="dxa" w:w="3216"/>
+            <w:tcW w:type="dxa" w:w="2880"/>
           </w:tcPr>
           <w:p>
-            <w:r/>
             <w:r>
               <w:rPr>
                 <w:i/>
@@ -393,15 +464,14 @@
         </w:tc>
         <w:tc>
           <w:tcPr>
-            <w:tcW w:type="dxa" w:w="3216"/>
+            <w:tcW w:type="dxa" w:w="2880"/>
           </w:tcPr>
           <w:p>
-            <w:r/>
             <w:r>
               <w:rPr>
                 <w:b/>
               </w:rPr>
-              <w:t>19%</w:t>
+              <w:t>16%</w:t>
             </w:r>
           </w:p>
         </w:tc>
@@ -409,10 +479,9 @@
       <w:tr>
         <w:tc>
           <w:tcPr>
-            <w:tcW w:type="dxa" w:w="3216"/>
+            <w:tcW w:type="dxa" w:w="2880"/>
           </w:tcPr>
           <w:p>
-            <w:r/>
             <w:r>
               <w:t>Cofounder — Marketing, Sales &amp; Partnerships</w:t>
             </w:r>
@@ -420,10 +489,9 @@
         </w:tc>
         <w:tc>
           <w:tcPr>
-            <w:tcW w:type="dxa" w:w="3216"/>
+            <w:tcW w:type="dxa" w:w="2880"/>
           </w:tcPr>
           <w:p>
-            <w:r/>
             <w:r>
               <w:t>[●]</w:t>
             </w:r>
@@ -431,12 +499,11 @@
         </w:tc>
         <w:tc>
           <w:tcPr>
-            <w:tcW w:type="dxa" w:w="3216"/>
+            <w:tcW w:type="dxa" w:w="2880"/>
           </w:tcPr>
           <w:p>
-            <w:r/>
             <w:r>
-              <w:t>19%</w:t>
+              <w:t>16%</w:t>
             </w:r>
           </w:p>
         </w:tc>
@@ -444,10 +511,9 @@
       <w:tr>
         <w:tc>
           <w:tcPr>
-            <w:tcW w:type="dxa" w:w="3216"/>
+            <w:tcW w:type="dxa" w:w="2880"/>
           </w:tcPr>
           <w:p>
-            <w:r/>
             <w:r>
               <w:t>Cofounder — Security Engineering &amp; Trust</w:t>
             </w:r>
@@ -455,10 +521,9 @@
         </w:tc>
         <w:tc>
           <w:tcPr>
-            <w:tcW w:type="dxa" w:w="3216"/>
+            <w:tcW w:type="dxa" w:w="2880"/>
           </w:tcPr>
           <w:p>
-            <w:r/>
             <w:r>
               <w:t>[●]</w:t>
             </w:r>
@@ -466,12 +531,11 @@
         </w:tc>
         <w:tc>
           <w:tcPr>
-            <w:tcW w:type="dxa" w:w="3216"/>
+            <w:tcW w:type="dxa" w:w="2880"/>
           </w:tcPr>
           <w:p>
-            <w:r/>
             <w:r>
-              <w:t>19%</w:t>
+              <w:t>16%</w:t>
             </w:r>
           </w:p>
         </w:tc>
@@ -479,10 +543,41 @@
       <w:tr>
         <w:tc>
           <w:tcPr>
-            <w:tcW w:type="dxa" w:w="3216"/>
+            <w:tcW w:type="dxa" w:w="2880"/>
           </w:tcPr>
           <w:p>
-            <w:r/>
+            <w:r>
+              <w:t>Cofounder — Legal, Compliance &amp; Research</w:t>
+            </w:r>
+          </w:p>
+        </w:tc>
+        <w:tc>
+          <w:tcPr>
+            <w:tcW w:type="dxa" w:w="2880"/>
+          </w:tcPr>
+          <w:p>
+            <w:r>
+              <w:t>[●]</w:t>
+            </w:r>
+          </w:p>
+        </w:tc>
+        <w:tc>
+          <w:tcPr>
+            <w:tcW w:type="dxa" w:w="2880"/>
+          </w:tcPr>
+          <w:p>
+            <w:r>
+              <w:t>16%</w:t>
+            </w:r>
+          </w:p>
+        </w:tc>
+      </w:tr>
+      <w:tr>
+        <w:tc>
+          <w:tcPr>
+            <w:tcW w:type="dxa" w:w="2880"/>
+          </w:tcPr>
+          <w:p>
             <w:r>
               <w:t>Unallocated reserve (future hires / option pool)</w:t>
             </w:r>
@@ -490,10 +585,9 @@
         </w:tc>
         <w:tc>
           <w:tcPr>
-            <w:tcW w:type="dxa" w:w="3216"/>
+            <w:tcW w:type="dxa" w:w="2880"/>
           </w:tcPr>
           <w:p>
-            <w:r/>
             <w:r>
               <w:t>held for unanimous founder decision</w:t>
             </w:r>
@@ -501,12 +595,14 @@
         </w:tc>
         <w:tc>
           <w:tcPr>
-            <w:tcW w:type="dxa" w:w="3216"/>
+            <w:tcW w:type="dxa" w:w="2880"/>
           </w:tcPr>
           <w:p>
-            <w:r/>
             <w:r>
-              <w:t>3%</w:t>
+              <w:rPr>
+                <w:b/>
+              </w:rPr>
+              <w:t>20%</w:t>
             </w:r>
           </w:p>
         </w:tc>
@@ -514,10 +610,9 @@
       <w:tr>
         <w:tc>
           <w:tcPr>
-            <w:tcW w:type="dxa" w:w="3216"/>
+            <w:tcW w:type="dxa" w:w="2880"/>
           </w:tcPr>
           <w:p>
-            <w:r/>
             <w:r>
               <w:rPr>
                 <w:b/>
@@ -528,18 +623,15 @@
         </w:tc>
         <w:tc>
           <w:tcPr>
-            <w:tcW w:type="dxa" w:w="3216"/>
+            <w:tcW w:type="dxa" w:w="2880"/>
           </w:tcPr>
-          <w:p>
-            <w:r/>
-          </w:p>
+          <w:p/>
         </w:tc>
         <w:tc>
           <w:tcPr>
-            <w:tcW w:type="dxa" w:w="3216"/>
+            <w:tcW w:type="dxa" w:w="2880"/>
           </w:tcPr>
           <w:p>
-            <w:r/>
             <w:r>
               <w:rPr>
                 <w:b/>
@@ -553,6 +645,68 @@
     <w:p/>
     <w:p>
       <w:r>
+        <w:t xml:space="preserve">The reserve is set at </w:t>
+      </w:r>
+      <w:r>
+        <w:rPr>
+          <w:b/>
+        </w:rPr>
+        <w:t>20%</w:t>
+      </w:r>
+      <w:r>
+        <w:t xml:space="preserve"> — the market range for an early-stage option pool —</w:t>
+      </w:r>
+    </w:p>
+    <w:p>
+      <w:r>
+        <w:t xml:space="preserve">and is created </w:t>
+      </w:r>
+      <w:r>
+        <w:rPr>
+          <w:b/>
+        </w:rPr>
+        <w:t>at incorporation</w:t>
+      </w:r>
+      <w:r>
+        <w:t xml:space="preserve"> so that future hires and stock options are</w:t>
+      </w:r>
+    </w:p>
+    <w:p>
+      <w:r>
+        <w:t>funded from the reserve instead of diluting founders later. Any top-up beyond 20%</w:t>
+      </w:r>
+    </w:p>
+    <w:p>
+      <w:r>
+        <w:t>requires unanimous founder consent (Annex A, clause 5). Equal equity reflects the</w:t>
+      </w:r>
+    </w:p>
+    <w:p>
+      <w:r>
+        <w:t xml:space="preserve">work done </w:t>
+      </w:r>
+      <w:r>
+        <w:rPr>
+          <w:i/>
+        </w:rPr>
+        <w:t>after</w:t>
+      </w:r>
+      <w:r>
+        <w:t xml:space="preserve"> the start date; the CEO's pre-founding build is acknowledged</w:t>
+      </w:r>
+    </w:p>
+    <w:p>
+      <w:r>
+        <w:t>through role and casting-vote authority, not extra equity. Percentages above are</w:t>
+      </w:r>
+    </w:p>
+    <w:p>
+      <w:r>
+        <w:t>indicative pending the Founders' Shareholders' Agreement.</w:t>
+      </w:r>
+    </w:p>
+    <w:p>
+      <w:r>
         <w:t>All founder equity vests on identical terms (Annex A). No seat carries special</w:t>
       </w:r>
     </w:p>
@@ -566,13 +720,11 @@
         <w:pStyle w:val="Heading2"/>
       </w:pPr>
       <w:r>
-        <w:rPr>
-          <w:color w:val="1A1A1A"/>
-        </w:rPr>
         <w:t>1. Why this seat exists</w:t>
       </w:r>
-    </w:p>
-    <w:p>
+      <w:r>
+        <w:br/>
+      </w:r>
       <w:r>
         <w:t xml:space="preserve">BuddyUp is raising </w:t>
       </w:r>
@@ -585,33 +737,39 @@
       <w:r>
         <w:t>, with a conservative model</w:t>
       </w:r>
-    </w:p>
-    <w:p>
+      <w:r>
+        <w:br/>
+      </w:r>
       <w:r>
         <w:t>showing ~KSh 41m needed for 24 months before contingency. Money moves through M-PESA and</w:t>
       </w:r>
-    </w:p>
-    <w:p>
+      <w:r>
+        <w:br/>
+      </w:r>
       <w:r>
         <w:t>card rails to gyms, coaches and creators; artifacts exist only as non-cash loyalty</w:t>
       </w:r>
-    </w:p>
-    <w:p>
+      <w:r>
+        <w:br/>
+      </w:r>
       <w:r>
         <w:t>tokens, deliberately kept away from CBK stored-value territory. The funded plan includes</w:t>
       </w:r>
-    </w:p>
-    <w:p>
+      <w:r>
+        <w:br/>
+      </w:r>
       <w:r>
         <w:t>a payment-operations budget and a board-controlled contingency reserve.</w:t>
       </w:r>
-    </w:p>
-    <w:p>
+      <w:r>
+        <w:br/>
+      </w:r>
       <w:r>
         <w:t>That plan needs an owner: someone who keeps cash truthful, settlements clean, the model</w:t>
       </w:r>
-    </w:p>
-    <w:p>
+      <w:r>
+        <w:br/>
+      </w:r>
       <w:r>
         <w:t>current, and the company fundable.</w:t>
       </w:r>
@@ -621,21 +779,22 @@
         <w:pStyle w:val="Heading2"/>
       </w:pPr>
       <w:r>
-        <w:rPr>
-          <w:color w:val="1A1A1A"/>
-        </w:rPr>
         <w:t>2. Mandate</w:t>
       </w:r>
-    </w:p>
-    <w:p>
+      <w:r>
+        <w:br/>
+      </w:r>
       <w:r>
         <w:t>Own everything financial and the strategy cadence around it:</w:t>
       </w:r>
     </w:p>
     <w:p>
       <w:pPr>
-        <w:pStyle w:val="ListNumber"/>
+        <w:ind w:left="360"/>
       </w:pPr>
+      <w:r>
+        <w:t xml:space="preserve">1. </w:t>
+      </w:r>
       <w:r>
         <w:rPr>
           <w:b/>
@@ -650,13 +809,15 @@
       <w:r>
         <w:t>Set up and own the accounting system (Kenyan GAAP/IFRS-SME as advised), monthly</w:t>
       </w:r>
-    </w:p>
-    <w:p>
+      <w:r>
+        <w:br/>
+      </w:r>
       <w:r>
         <w:t>close by working day 10, and a single source of truth dashboard: cash, burn,</w:t>
       </w:r>
-    </w:p>
-    <w:p>
+      <w:r>
+        <w:br/>
+      </w:r>
       <w:r>
         <w:t>revenue by stream (Partner SaaS / commissions / Plus), receivables.</w:t>
       </w:r>
@@ -668,8 +829,9 @@
       <w:r>
         <w:t>Own M-PESA/card reconciliation against platform ledgers with the Security</w:t>
       </w:r>
-    </w:p>
-    <w:p>
+      <w:r>
+        <w:br/>
+      </w:r>
       <w:r>
         <w:t>cofounder; every shilling authorised, documented and matched.</w:t>
       </w:r>
@@ -681,16 +843,20 @@
       <w:r>
         <w:t>Statutory compliance calendar: KRA filings (VAT/PAYE/corporate), annual returns,</w:t>
       </w:r>
-    </w:p>
-    <w:p>
+      <w:r>
+        <w:br/>
+      </w:r>
       <w:r>
         <w:t>audit readiness when required.</w:t>
       </w:r>
     </w:p>
     <w:p>
       <w:pPr>
-        <w:pStyle w:val="ListNumber"/>
+        <w:ind w:left="360"/>
       </w:pPr>
+      <w:r>
+        <w:t xml:space="preserve">2. </w:t>
+      </w:r>
       <w:r>
         <w:rPr>
           <w:b/>
@@ -705,16 +871,20 @@
       <w:r>
         <w:t>Administer the refund/dispute buffer per policy (with Legal); run controlled</w:t>
       </w:r>
-    </w:p>
-    <w:p>
+      <w:r>
+        <w:br/>
+      </w:r>
       <w:r>
         <w:t>partner settlement cycles; ensure the company never holds unauthorised customer funds.</w:t>
       </w:r>
     </w:p>
     <w:p>
       <w:pPr>
-        <w:pStyle w:val="ListNumber"/>
+        <w:ind w:left="360"/>
       </w:pPr>
+      <w:r>
+        <w:t xml:space="preserve">3. </w:t>
+      </w:r>
       <w:r>
         <w:rPr>
           <w:b/>
@@ -729,8 +899,9 @@
       <w:r>
         <w:t>Maintain the bottom-up 24-month operating model; refresh the cash forecast</w:t>
       </w:r>
-    </w:p>
-    <w:p>
+      <w:r>
+        <w:br/>
+      </w:r>
       <w:r>
         <w:t>monthly; flag variance &gt;10% to the founders within the same month.</w:t>
       </w:r>
@@ -742,16 +913,20 @@
       <w:r>
         <w:t>Administer the board-controlled contingency release process exactly as written</w:t>
       </w:r>
-    </w:p>
-    <w:p>
+      <w:r>
+        <w:br/>
+      </w:r>
       <w:r>
         <w:t>in the funding plan — unused contingency stays uncommitted.</w:t>
       </w:r>
     </w:p>
     <w:p>
       <w:pPr>
-        <w:pStyle w:val="ListNumber"/>
+        <w:ind w:left="360"/>
       </w:pPr>
+      <w:r>
+        <w:t xml:space="preserve">4. </w:t>
+      </w:r>
       <w:r>
         <w:rPr>
           <w:b/>
@@ -774,16 +949,20 @@
       <w:r>
         <w:t>Co-build seed materials with the CEO; run investor follow-ups and diligence;</w:t>
       </w:r>
-    </w:p>
-    <w:p>
+      <w:r>
+        <w:br/>
+      </w:r>
       <w:r>
         <w:t>keep the cap table clean and option-pool maths honest.</w:t>
       </w:r>
     </w:p>
     <w:p>
       <w:pPr>
-        <w:pStyle w:val="ListNumber"/>
+        <w:ind w:left="360"/>
       </w:pPr>
+      <w:r>
+        <w:t xml:space="preserve">5. </w:t>
+      </w:r>
       <w:r>
         <w:rPr>
           <w:b/>
@@ -798,13 +977,15 @@
       <w:r>
         <w:t>Run quarterly strategy reviews against the business model doc; keep the KPI tree</w:t>
       </w:r>
-    </w:p>
-    <w:p>
+      <w:r>
+        <w:br/>
+      </w:r>
       <w:r>
         <w:t>(activated members → paying partners → revenue) current; kill zombie initiatives</w:t>
       </w:r>
-    </w:p>
-    <w:p>
+      <w:r>
+        <w:br/>
+      </w:r>
       <w:r>
         <w:t>in writing.</w:t>
       </w:r>
@@ -814,9 +995,6 @@
         <w:pStyle w:val="Heading2"/>
       </w:pPr>
       <w:r>
-        <w:rPr>
-          <w:color w:val="1A1A1A"/>
-        </w:rPr>
         <w:t>3. Decision rights</w:t>
       </w:r>
     </w:p>
@@ -833,8 +1011,9 @@
       <w:r>
         <w:t xml:space="preserve"> banking/signatory setup (joint control with CEO above [●] KSh),</w:t>
       </w:r>
-    </w:p>
-    <w:p>
+      <w:r>
+        <w:br/>
+      </w:r>
       <w:r>
         <w:t>accounting tooling, bookkeeper/auditor engagement, monthly reporting format.</w:t>
       </w:r>
@@ -852,13 +1031,15 @@
       <w:r>
         <w:t xml:space="preserve"> any spend outside the approved plan that reduces</w:t>
       </w:r>
-    </w:p>
-    <w:p>
+      <w:r>
+        <w:br/>
+      </w:r>
       <w:r>
         <w:t>runway below 9 months without founder consensus; any payment flow that could be</w:t>
       </w:r>
-    </w:p>
-    <w:p>
+      <w:r>
+        <w:br/>
+      </w:r>
       <w:r>
         <w:t>construed as holding customer funds.</w:t>
       </w:r>
@@ -876,10 +1057,150 @@
       <w:r>
         <w:t xml:space="preserve"> all contracts &gt;[●] KSh, hiring beyond plan,</w:t>
       </w:r>
+      <w:r>
+        <w:br/>
+      </w:r>
+      <w:r>
+        <w:t>contingency releases, pricing architecture changes.</w:t>
+      </w:r>
     </w:p>
     <w:p>
-      <w:r>
-        <w:t>contingency releases, pricing architecture changes.</w:t>
+      <w:pPr>
+        <w:pStyle w:val="Heading3"/>
+      </w:pPr>
+      <w:r>
+        <w:t>Deadlocks &amp; the CEO casting vote</w:t>
+      </w:r>
+      <w:r>
+        <w:br/>
+      </w:r>
+      <w:r>
+        <w:t>Each founder decides their own domain (above). For cross-domain or company-level</w:t>
+      </w:r>
+      <w:r>
+        <w:br/>
+      </w:r>
+      <w:r>
+        <w:t>decisions that deadlock after genuine discussion:</w:t>
+      </w:r>
+    </w:p>
+    <w:p>
+      <w:pPr>
+        <w:ind w:left="360"/>
+      </w:pPr>
+      <w:r>
+        <w:t>1. Each position is written down with reasons and evidence (one page max).</w:t>
+      </w:r>
+    </w:p>
+    <w:p>
+      <w:pPr>
+        <w:ind w:left="360"/>
+      </w:pPr>
+      <w:r>
+        <w:t>2. A 48-hour cool-off follows; most disagreements dissolve here.</w:t>
+      </w:r>
+    </w:p>
+    <w:p>
+      <w:pPr>
+        <w:ind w:left="360"/>
+      </w:pPr>
+      <w:r>
+        <w:t xml:space="preserve">3. If not, the </w:t>
+      </w:r>
+      <w:r>
+        <w:rPr>
+          <w:b/>
+        </w:rPr>
+        <w:t>CEO casts the deciding vote</w:t>
+      </w:r>
+      <w:r>
+        <w:t>, with written reasons within five</w:t>
+      </w:r>
+    </w:p>
+    <w:p>
+      <w:r>
+        <w:t>working days.</w:t>
+      </w:r>
+    </w:p>
+    <w:p>
+      <w:pPr>
+        <w:ind w:left="360"/>
+      </w:pPr>
+      <w:r>
+        <w:t xml:space="preserve">4. The decision is recorded in writing and everyone </w:t>
+      </w:r>
+      <w:r>
+        <w:rPr>
+          <w:b/>
+        </w:rPr>
+        <w:t>disagrees and commits</w:t>
+      </w:r>
+      <w:r>
+        <w:t xml:space="preserve"> —</w:t>
+      </w:r>
+    </w:p>
+    <w:p>
+      <w:r>
+        <w:t>no relitigating.</w:t>
+      </w:r>
+    </w:p>
+    <w:p>
+      <w:pPr>
+        <w:ind w:left="360"/>
+      </w:pPr>
+      <w:r>
+        <w:t>5. The CEO is recused from casting on decisions that directly affect the CEO's</w:t>
+      </w:r>
+    </w:p>
+    <w:p>
+      <w:r>
+        <w:t>own equity, role or removal.</w:t>
+      </w:r>
+    </w:p>
+    <w:p>
+      <w:pPr>
+        <w:ind w:left="360"/>
+      </w:pPr>
+      <w:r>
+        <w:t xml:space="preserve">6. </w:t>
+      </w:r>
+      <w:r>
+        <w:rPr>
+          <w:b/>
+        </w:rPr>
+        <w:t>Reserved matters</w:t>
+      </w:r>
+      <w:r>
+        <w:t xml:space="preserve"> are never settled by the casting vote alone — selling or</w:t>
+      </w:r>
+    </w:p>
+    <w:p>
+      <w:r>
+        <w:t>dissolving the company, removing or adding a cofounder, changing the equity</w:t>
+      </w:r>
+    </w:p>
+    <w:p>
+      <w:r>
+        <w:t>split, or removing the CEO follow the Founders' Shareholders' Agreement.</w:t>
+      </w:r>
+    </w:p>
+    <w:p>
+      <w:r>
+        <w:t>Rationale and options analysis: [</w:t>
+      </w:r>
+      <w:r>
+        <w:rPr>
+          <w:rFonts w:ascii="Consolas" w:hAnsi="Consolas"/>
+        </w:rPr>
+        <w:t>README.md</w:t>
+      </w:r>
+      <w:r>
+        <w:t>](README.md) — "Decision-making &amp; the</w:t>
+      </w:r>
+    </w:p>
+    <w:p>
+      <w:r>
+        <w:t>CEO casting vote". The mechanism becomes binding in the shareholders' agreement.</w:t>
       </w:r>
     </w:p>
     <w:p>
@@ -887,9 +1208,6 @@
         <w:pStyle w:val="Heading2"/>
       </w:pPr>
       <w:r>
-        <w:rPr>
-          <w:color w:val="1A1A1A"/>
-        </w:rPr>
         <w:t>4. Commitment</w:t>
       </w:r>
     </w:p>
@@ -898,7 +1216,34 @@
         <w:pStyle w:val="ListBullet"/>
       </w:pPr>
       <w:r>
-        <w:t>Full-time from the start date.</w:t>
+        <w:rPr>
+          <w:b/>
+        </w:rPr>
+        <w:t>Part-time founding role:</w:t>
+      </w:r>
+      <w:r>
+        <w:t xml:space="preserve"> you commit a minimum of </w:t>
+      </w:r>
+      <w:r>
+        <w:rPr>
+          <w:b/>
+        </w:rPr>
+        <w:t>10 hours per week</w:t>
+      </w:r>
+      <w:r>
+        <w:t xml:space="preserve"> on</w:t>
+      </w:r>
+      <w:r>
+        <w:br/>
+      </w:r>
+      <w:r>
+        <w:t>average, scheduled flexibly around existing commitments. This is a</w:t>
+      </w:r>
+      <w:r>
+        <w:br/>
+      </w:r>
+      <w:r>
+        <w:t>build-the-company seat with real deliverables, not an advisory arrangement.</w:t>
       </w:r>
     </w:p>
     <w:p>
@@ -906,13 +1251,34 @@
         <w:pStyle w:val="ListBullet"/>
       </w:pPr>
       <w:r>
+        <w:t xml:space="preserve">Commitment is measured by </w:t>
+      </w:r>
+      <w:r>
         <w:rPr>
           <w:b/>
         </w:rPr>
-        <w:t>Foundations period (first 90 days):</w:t>
-      </w:r>
-      <w:r>
-        <w:t xml:space="preserve"> mutual trial per Annex A.</w:t>
+        <w:t>outcomes</w:t>
+      </w:r>
+      <w:r>
+        <w:t xml:space="preserve"> — the mandate in clause 2 and the</w:t>
+      </w:r>
+      <w:r>
+        <w:br/>
+      </w:r>
+      <w:r>
+        <w:t>deliverables in clause 6 — not hours logged. Where a close, filing or</w:t>
+      </w:r>
+      <w:r>
+        <w:br/>
+      </w:r>
+      <w:r>
+        <w:t>negotiation needs a focused push, you make reasonable additional time</w:t>
+      </w:r>
+      <w:r>
+        <w:br/>
+      </w:r>
+      <w:r>
+        <w:t>available by prior agreement.</w:t>
       </w:r>
     </w:p>
     <w:p>
@@ -920,7 +1286,53 @@
         <w:pStyle w:val="ListBullet"/>
       </w:pPr>
       <w:r>
-        <w:t>Directorship expected once the shareholders' agreement is signed.</w:t>
+        <w:t>Commitment level is reviewed together after the foundations period; moving to</w:t>
+      </w:r>
+      <w:r>
+        <w:br/>
+      </w:r>
+      <w:r>
+        <w:t>full-time later is by mutual agreement as the company grows.</w:t>
+      </w:r>
+    </w:p>
+    <w:p>
+      <w:pPr>
+        <w:pStyle w:val="ListBullet"/>
+      </w:pPr>
+      <w:r>
+        <w:rPr>
+          <w:b/>
+        </w:rPr>
+        <w:t>Foundations period (first 90 days):</w:t>
+      </w:r>
+      <w:r>
+        <w:t xml:space="preserve"> mutual trial. Either side may part ways</w:t>
+      </w:r>
+      <w:r>
+        <w:br/>
+      </w:r>
+      <w:r>
+        <w:t>before day 90 with no vested equity and no ongoing obligations beyond confidentiality.</w:t>
+      </w:r>
+    </w:p>
+    <w:p>
+      <w:pPr>
+        <w:pStyle w:val="ListBullet"/>
+      </w:pPr>
+      <w:r>
+        <w:t>Directorship is expected once the shareholders' agreement is signed, and only</w:t>
+      </w:r>
+      <w:r>
+        <w:br/>
+      </w:r>
+      <w:r>
+        <w:t>after director protections are in place (D&amp;O insurance and/or an indemnity to</w:t>
+      </w:r>
+      <w:r>
+        <w:br/>
+      </w:r>
+      <w:r>
+        <w:t>the fullest extent permitted by the Companies Act 2015 — clause 8).</w:t>
       </w:r>
     </w:p>
     <w:p>
@@ -928,13 +1340,11 @@
         <w:pStyle w:val="Heading2"/>
       </w:pPr>
       <w:r>
-        <w:rPr>
-          <w:color w:val="1A1A1A"/>
-        </w:rPr>
         <w:t>5. Equity — summary</w:t>
       </w:r>
-    </w:p>
-    <w:p>
+      <w:r>
+        <w:br/>
+      </w:r>
       <w:r>
         <w:t xml:space="preserve">Grant of </w:t>
       </w:r>
@@ -942,20 +1352,28 @@
         <w:rPr>
           <w:b/>
         </w:rPr>
-        <w:t>19%</w:t>
-      </w:r>
-      <w:r>
-        <w:t xml:space="preserve"> fully-diluted at grant; vesting and leaver terms per Annex A.</w:t>
-      </w:r>
-    </w:p>
-    <w:p>
-      <w:r>
-        <w:t>Equity subject to IP assignment (clause 7) and execution of the shareholders'</w:t>
-      </w:r>
-    </w:p>
-    <w:p>
-      <w:r>
-        <w:t>agreement.</w:t>
+        <w:t>16%</w:t>
+      </w:r>
+      <w:r>
+        <w:t xml:space="preserve"> fully-diluted at grant — equal across all five founder seats —</w:t>
+      </w:r>
+      <w:r>
+        <w:br/>
+      </w:r>
+      <w:r>
+        <w:t>alongside a 20% unallocated reserve created at incorporation; vesting and leaver</w:t>
+      </w:r>
+      <w:r>
+        <w:br/>
+      </w:r>
+      <w:r>
+        <w:t>terms per Annex A (bad-leaver buy-back at fair market value). Equity subject to</w:t>
+      </w:r>
+      <w:r>
+        <w:br/>
+      </w:r>
+      <w:r>
+        <w:t>IP assignment (clause 7) and execution of the shareholders' agreement.</w:t>
       </w:r>
     </w:p>
     <w:p>
@@ -963,18 +1381,15 @@
         <w:pStyle w:val="Heading2"/>
       </w:pPr>
       <w:r>
-        <w:rPr>
-          <w:color w:val="1A1A1A"/>
-        </w:rPr>
         <w:t>6. First 90 days — success looks like</w:t>
       </w:r>
     </w:p>
     <w:p>
       <w:pPr>
-        <w:pStyle w:val="ListNumber"/>
+        <w:ind w:left="360"/>
       </w:pPr>
       <w:r>
-        <w:t>Accounting system live; opening balances reconciled; share register and cap table</w:t>
+        <w:t>1. Accounting system live; opening balances reconciled; share register and cap table</w:t>
       </w:r>
     </w:p>
     <w:p>
@@ -984,18 +1399,18 @@
     </w:p>
     <w:p>
       <w:pPr>
-        <w:pStyle w:val="ListNumber"/>
+        <w:ind w:left="360"/>
       </w:pPr>
       <w:r>
-        <w:t>Monthly close #1 delivered on time with a one-page burn/variance summary.</w:t>
+        <w:t>2. Monthly close #1 delivered on time with a one-page burn/variance summary.</w:t>
       </w:r>
     </w:p>
     <w:p>
       <w:pPr>
-        <w:pStyle w:val="ListNumber"/>
+        <w:ind w:left="360"/>
       </w:pPr>
       <w:r>
-        <w:t>M-PESA/card-to-ledger reconciliation running with zero unmatched items older than</w:t>
+        <w:t>3. M-PESA/card-to-ledger reconciliation running with zero unmatched items older than</w:t>
       </w:r>
     </w:p>
     <w:p>
@@ -1005,23 +1420,99 @@
     </w:p>
     <w:p>
       <w:pPr>
-        <w:pStyle w:val="ListNumber"/>
+        <w:ind w:left="360"/>
       </w:pPr>
       <w:r>
-        <w:t>Data room v1 complete enough for an investor's first diligence request.</w:t>
+        <w:t>4. Data room v1 complete enough for an investor's first diligence request.</w:t>
       </w:r>
     </w:p>
     <w:p>
       <w:pPr>
-        <w:pStyle w:val="ListNumber"/>
+        <w:ind w:left="360"/>
       </w:pPr>
       <w:r>
-        <w:t>Rolling 24-month model refreshed and signed off by all founders; contingency</w:t>
+        <w:t>5. Rolling 24-month model refreshed and signed off by all founders; contingency</w:t>
       </w:r>
     </w:p>
     <w:p>
       <w:r>
         <w:t>release protocol documented.</w:t>
+      </w:r>
+    </w:p>
+    <w:p>
+      <w:r>
+        <w:rPr>
+          <w:b/>
+        </w:rPr>
+        <w:t>How the 90 days are measured — deliberately realistic:</w:t>
+      </w:r>
+    </w:p>
+    <w:p>
+      <w:pPr>
+        <w:pStyle w:val="ListBullet"/>
+      </w:pPr>
+      <w:r>
+        <w:t>Your obligation is to take each listed action with all reasonable skill and</w:t>
+      </w:r>
+      <w:r>
+        <w:br/>
+      </w:r>
+      <w:r>
+        <w:t>care, keep the founding team informed, and escalate blockers early.</w:t>
+      </w:r>
+    </w:p>
+    <w:p>
+      <w:pPr>
+        <w:pStyle w:val="ListBullet"/>
+      </w:pPr>
+      <w:r>
+        <w:t>Where a step depends on a third party (KRA, banks, advocates, M-PESA/card</w:t>
+      </w:r>
+      <w:r>
+        <w:br/>
+      </w:r>
+      <w:r>
+        <w:t>providers) and that party's processing exceeds its stated timeline, the</w:t>
+      </w:r>
+      <w:r>
+        <w:br/>
+      </w:r>
+      <w:r>
+        <w:t>deadline extends day-for-day **without the deliverable being treated as</w:t>
+      </w:r>
+      <w:r>
+        <w:br/>
+      </w:r>
+      <w:r>
+        <w:t>failed** — provided you filed or prompted promptly and can evidence it.</w:t>
+      </w:r>
+    </w:p>
+    <w:p>
+      <w:pPr>
+        <w:pStyle w:val="ListBullet"/>
+      </w:pPr>
+      <w:r>
+        <w:t>At a day-60 checkpoint you and the CEO may re-scope the list by mutual written</w:t>
+      </w:r>
+      <w:r>
+        <w:br/>
+      </w:r>
+      <w:r>
+        <w:t>agreement, without stigma or effect on vesting.</w:t>
+      </w:r>
+    </w:p>
+    <w:p>
+      <w:pPr>
+        <w:pStyle w:val="ListBullet"/>
+      </w:pPr>
+      <w:r>
+        <w:t>This flexibility does not absolve the obligations: unexplained stalls with no</w:t>
+      </w:r>
+      <w:r>
+        <w:br/>
+      </w:r>
+      <w:r>
+        <w:t>third-party cause remain a legitimate concern under the foundations period.</w:t>
       </w:r>
     </w:p>
     <w:p>
@@ -1029,10 +1520,7 @@
         <w:pStyle w:val="Heading2"/>
       </w:pPr>
       <w:r>
-        <w:rPr>
-          <w:color w:val="1A1A1A"/>
-        </w:rPr>
-        <w:t>7. IP, confidentiality &amp; conflicts</w:t>
+        <w:t>7. IP, confidentiality &amp; declaration of interests</w:t>
       </w:r>
     </w:p>
     <w:p>
@@ -1048,12 +1536,19 @@
         <w:pStyle w:val="ListBullet"/>
       </w:pPr>
       <w:r>
-        <w:t>Financial confidentiality is indefinite and starts now; personal conflicts and</w:t>
-      </w:r>
-    </w:p>
-    <w:p>
-      <w:r>
-        <w:t>other directorships must be declared before signature.</w:t>
+        <w:t>Financial confidentiality is indefinite and starts now. You will handle inside</w:t>
+      </w:r>
+      <w:r>
+        <w:br/>
+      </w:r>
+      <w:r>
+        <w:t>information (fundraise, metrics); market abuse and insider dealing obligations</w:t>
+      </w:r>
+      <w:r>
+        <w:br/>
+      </w:r>
+      <w:r>
+        <w:t>are taken seriously from day one.</w:t>
       </w:r>
     </w:p>
     <w:p>
@@ -1061,12 +1556,117 @@
         <w:pStyle w:val="ListBullet"/>
       </w:pPr>
       <w:r>
-        <w:t>You will handle inside information (fundraise, metrics); market abuse and insider</w:t>
+        <w:rPr>
+          <w:b/>
+        </w:rPr>
+        <w:t>Declaration of interests (not a blanket conflicts bar):</w:t>
       </w:r>
     </w:p>
     <w:p>
-      <w:r>
-        <w:t>dealing obligations are taken seriously from day one.</w:t>
+      <w:pPr>
+        <w:pStyle w:val="ListBullet2"/>
+      </w:pPr>
+      <w:r>
+        <w:t>Before signature you complete a written declaration of interests covering</w:t>
+      </w:r>
+      <w:r>
+        <w:br/>
+      </w:r>
+      <w:r>
+        <w:t>current employment, businesses, directorships, significant investments and</w:t>
+      </w:r>
+      <w:r>
+        <w:br/>
+      </w:r>
+      <w:r>
+        <w:t>other commitments. A short template is attached to the shareholders' agreement.</w:t>
+      </w:r>
+    </w:p>
+    <w:p>
+      <w:pPr>
+        <w:pStyle w:val="ListBullet2"/>
+      </w:pPr>
+      <w:r>
+        <w:t xml:space="preserve">Outside work is </w:t>
+      </w:r>
+      <w:r>
+        <w:rPr>
+          <w:b/>
+        </w:rPr>
+        <w:t>permitted</w:t>
+      </w:r>
+      <w:r>
+        <w:t xml:space="preserve"> and is not, by itself, a conflict. What must be</w:t>
+      </w:r>
+      <w:r>
+        <w:br/>
+      </w:r>
+      <w:r>
+        <w:t>disclosed is anything that could materially impair impartiality, divert</w:t>
+      </w:r>
+      <w:r>
+        <w:br/>
+      </w:r>
+      <w:r>
+        <w:t>BuddyUp's financial or strategic work elsewhere, or place you opposite the</w:t>
+      </w:r>
+      <w:r>
+        <w:br/>
+      </w:r>
+      <w:r>
+        <w:t>company (e.g. acting for a competitor, an investor in dispute with BuddyUp,</w:t>
+      </w:r>
+      <w:r>
+        <w:br/>
+      </w:r>
+      <w:r>
+        <w:t>or a counterparty in a BuddyUp transaction).</w:t>
+      </w:r>
+    </w:p>
+    <w:p>
+      <w:pPr>
+        <w:pStyle w:val="ListBullet2"/>
+      </w:pPr>
+      <w:r>
+        <w:t>If a declared interest later becomes a genuine conflict in a specific matter,</w:t>
+      </w:r>
+      <w:r>
+        <w:br/>
+      </w:r>
+      <w:r>
+        <w:t>it is managed case by case — recusal, an information barrier, or re-scoping —</w:t>
+      </w:r>
+      <w:r>
+        <w:br/>
+      </w:r>
+      <w:r>
+        <w:t>rather than by prohibiting the outside work.</w:t>
+      </w:r>
+    </w:p>
+    <w:p>
+      <w:pPr>
+        <w:pStyle w:val="ListBullet2"/>
+      </w:pPr>
+      <w:r>
+        <w:t>The declaration is a living document: refreshed on material change and at</w:t>
+      </w:r>
+      <w:r>
+        <w:br/>
+      </w:r>
+      <w:r>
+        <w:t>least every six months, with the company keeping a simple register.</w:t>
+      </w:r>
+      <w:r>
+        <w:br/>
+      </w:r>
+      <w:r>
+        <w:t>Good-faith disclosure is always safe; only concealment of a known, material</w:t>
+      </w:r>
+      <w:r>
+        <w:br/>
+      </w:r>
+      <w:r>
+        <w:t>interest is a breach.</w:t>
       </w:r>
     </w:p>
     <w:p>
@@ -1074,34 +1674,122 @@
         <w:pStyle w:val="Heading2"/>
       </w:pPr>
       <w:r>
-        <w:rPr>
-          <w:color w:val="1A1A1A"/>
-        </w:rPr>
         <w:t>8. Conditions precedent</w:t>
       </w:r>
     </w:p>
     <w:p>
       <w:pPr>
-        <w:pStyle w:val="ListNumber"/>
+        <w:ind w:left="360"/>
       </w:pPr>
       <w:r>
-        <w:t>Executed Founders' Shareholders' Agreement (Kenyan advocate drafted).</w:t>
+        <w:t>1. Executed Founders' Shareholders' Agreement (Kenyan advocate drafted).</w:t>
       </w:r>
     </w:p>
     <w:p>
       <w:pPr>
-        <w:pStyle w:val="ListNumber"/>
+        <w:ind w:left="360"/>
       </w:pPr>
       <w:r>
-        <w:t>Bank mandate updated; signatory KYC completed.</w:t>
+        <w:t>2. Bank mandate updated; signatory KYC completed.</w:t>
       </w:r>
     </w:p>
     <w:p>
       <w:pPr>
-        <w:pStyle w:val="ListNumber"/>
+        <w:ind w:left="360"/>
       </w:pPr>
       <w:r>
-        <w:t>Declaration of conflicts; credit/reference check consent (standard for the role).</w:t>
+        <w:t>3. Declaration of interests (clause 7); credit/reference check consent</w:t>
+      </w:r>
+    </w:p>
+    <w:p>
+      <w:r>
+        <w:t>(standard for the role).</w:t>
+      </w:r>
+    </w:p>
+    <w:p>
+      <w:pPr>
+        <w:ind w:left="360"/>
+      </w:pPr>
+      <w:r>
+        <w:t>4. Director protections in place: D&amp;O insurance bound (or a written company</w:t>
+      </w:r>
+    </w:p>
+    <w:p>
+      <w:r>
+        <w:t>indemnity to the fullest extent permitted by the Companies Act 2015),</w:t>
+      </w:r>
+    </w:p>
+    <w:p>
+      <w:r>
+        <w:t>before board appointment paperwork is filed.</w:t>
+      </w:r>
+    </w:p>
+    <w:p>
+      <w:r>
+        <w:rPr>
+          <w:b/>
+        </w:rPr>
+        <w:t>External counsel costs.</w:t>
+      </w:r>
+      <w:r>
+        <w:t xml:space="preserve"> The advocate for the Founders' Shareholders'</w:t>
+      </w:r>
+    </w:p>
+    <w:p>
+      <w:r>
+        <w:t xml:space="preserve">Agreement is jointly retained and instructed by </w:t>
+      </w:r>
+      <w:r>
+        <w:rPr>
+          <w:b/>
+        </w:rPr>
+        <w:t>the company</w:t>
+      </w:r>
+      <w:r>
+        <w:t>, and those fees</w:t>
+      </w:r>
+    </w:p>
+    <w:p>
+      <w:r>
+        <w:t xml:space="preserve">are an </w:t>
+      </w:r>
+      <w:r>
+        <w:rPr>
+          <w:b/>
+        </w:rPr>
+        <w:t>operational expense of BuddyUp Ltd.</w:t>
+      </w:r>
+      <w:r>
+        <w:t xml:space="preserve"> — not a founder personal cost.</w:t>
+      </w:r>
+    </w:p>
+    <w:p>
+      <w:r>
+        <w:t>The engagement letter (scope, fee estimate and any cap) will be confirmed in</w:t>
+      </w:r>
+    </w:p>
+    <w:p>
+      <w:r>
+        <w:t xml:space="preserve">writing and shared with all founders </w:t>
+      </w:r>
+      <w:r>
+        <w:rPr>
+          <w:b/>
+        </w:rPr>
+        <w:t>before</w:t>
+      </w:r>
+      <w:r>
+        <w:t xml:space="preserve"> instruction. Any separate</w:t>
+      </w:r>
+    </w:p>
+    <w:p>
+      <w:r>
+        <w:t>personal-review advocate a founder chooses to engage for their own side review is</w:t>
+      </w:r>
+    </w:p>
+    <w:p>
+      <w:r>
+        <w:t>at that founder's own cost.</w:t>
       </w:r>
     </w:p>
     <w:p>
@@ -1109,34 +1797,25 @@
         <w:pStyle w:val="Heading2"/>
       </w:pPr>
       <w:r>
-        <w:rPr>
-          <w:color w:val="1A1A1A"/>
-        </w:rPr>
         <w:t>Signatures</w:t>
       </w:r>
     </w:p>
     <w:tbl>
       <w:tblPr>
-        <w:tblStyle w:val="LightGrid-Accent1"/>
+        <w:tblStyle w:val="TableGrid"/>
         <w:tblW w:type="auto" w:w="0"/>
-        <w:jc w:val="left"/>
         <w:tblLook w:firstColumn="1" w:firstRow="1" w:lastColumn="0" w:lastRow="0" w:noHBand="0" w:noVBand="1" w:val="04A0"/>
       </w:tblPr>
       <w:tblGrid>
-        <w:gridCol w:w="4824"/>
-        <w:gridCol w:w="4824"/>
+        <w:gridCol w:w="4320"/>
+        <w:gridCol w:w="4320"/>
       </w:tblGrid>
       <w:tr>
         <w:tc>
           <w:tcPr>
-            <w:tcW w:type="dxa" w:w="4824"/>
+            <w:tcW w:type="dxa" w:w="4320"/>
           </w:tcPr>
           <w:p>
-            <w:r>
-              <w:rPr>
-                <w:b/>
-              </w:rPr>
-            </w:r>
             <w:r>
               <w:rPr>
                 <w:b/>
@@ -1147,14 +1826,9 @@
         </w:tc>
         <w:tc>
           <w:tcPr>
-            <w:tcW w:type="dxa" w:w="4824"/>
+            <w:tcW w:type="dxa" w:w="4320"/>
           </w:tcPr>
           <w:p>
-            <w:r>
-              <w:rPr>
-                <w:b/>
-              </w:rPr>
-            </w:r>
             <w:r>
               <w:rPr>
                 <w:b/>
@@ -1167,10 +1841,9 @@
       <w:tr>
         <w:tc>
           <w:tcPr>
-            <w:tcW w:type="dxa" w:w="4824"/>
+            <w:tcW w:type="dxa" w:w="4320"/>
           </w:tcPr>
           <w:p>
-            <w:r/>
             <w:r>
               <w:t>Name: Peter Mbugua</w:t>
             </w:r>
@@ -1178,10 +1851,9 @@
         </w:tc>
         <w:tc>
           <w:tcPr>
-            <w:tcW w:type="dxa" w:w="4824"/>
+            <w:tcW w:type="dxa" w:w="4320"/>
           </w:tcPr>
           <w:p>
-            <w:r/>
             <w:r>
               <w:t>Name: [Full legal name]</w:t>
             </w:r>
@@ -1191,10 +1863,9 @@
       <w:tr>
         <w:tc>
           <w:tcPr>
-            <w:tcW w:type="dxa" w:w="4824"/>
+            <w:tcW w:type="dxa" w:w="4320"/>
           </w:tcPr>
           <w:p>
-            <w:r/>
             <w:r>
               <w:t>Title: Cofounder &amp; CEO</w:t>
             </w:r>
@@ -1202,10 +1873,9 @@
         </w:tc>
         <w:tc>
           <w:tcPr>
-            <w:tcW w:type="dxa" w:w="4824"/>
+            <w:tcW w:type="dxa" w:w="4320"/>
           </w:tcPr>
           <w:p>
-            <w:r/>
             <w:r>
               <w:t>ID/Passport: [●]</w:t>
             </w:r>
@@ -1215,10 +1885,9 @@
       <w:tr>
         <w:tc>
           <w:tcPr>
-            <w:tcW w:type="dxa" w:w="4824"/>
+            <w:tcW w:type="dxa" w:w="4320"/>
           </w:tcPr>
           <w:p>
-            <w:r/>
             <w:r>
               <w:t>Signature: ________________ Date: ______</w:t>
             </w:r>
@@ -1226,10 +1895,9 @@
         </w:tc>
         <w:tc>
           <w:tcPr>
-            <w:tcW w:type="dxa" w:w="4824"/>
+            <w:tcW w:type="dxa" w:w="4320"/>
           </w:tcPr>
           <w:p>
-            <w:r/>
             <w:r>
               <w:t>Signature: ________________ Date: ______</w:t>
             </w:r>
@@ -1240,24 +1908,14 @@
     <w:p/>
     <w:p>
       <w:pPr>
-        <w:spacing w:before="80"/>
-        <w:pBdr>
-          <w:bottom w:val="single" w:sz="6" w:color="BBBBBB"/>
-        </w:pBdr>
-      </w:pPr>
-    </w:p>
-    <w:p>
-      <w:pPr>
         <w:pStyle w:val="Heading2"/>
       </w:pPr>
       <w:r>
-        <w:rPr>
-          <w:color w:val="1A1A1A"/>
-        </w:rPr>
         <w:t>Annex A — Vesting schedule</w:t>
       </w:r>
-    </w:p>
-    <w:p>
+      <w:r>
+        <w:br/>
+      </w:r>
       <w:r>
         <w:rPr>
           <w:i/>
@@ -1267,65 +1925,346 @@
     </w:p>
     <w:p>
       <w:pPr>
-        <w:pStyle w:val="ListNumber"/>
+        <w:ind w:left="360"/>
       </w:pPr>
       <w:r>
-        <w:t>Grant of 19% of the fully-diluted capital of BuddyUp Ltd. as at the start date,</w:t>
+        <w:t xml:space="preserve">1. </w:t>
+      </w:r>
+      <w:r>
+        <w:rPr>
+          <w:b/>
+        </w:rPr>
+        <w:t>Grant:</w:t>
+      </w:r>
+      <w:r>
+        <w:t xml:space="preserve"> 16% of the fully-diluted capital of BuddyUp Ltd. as at the start</w:t>
       </w:r>
     </w:p>
     <w:p>
       <w:r>
-        <w:t>recorded in the share register.</w:t>
+        <w:t>date, recorded in the share register. Identical for every founder seat.</w:t>
       </w:r>
     </w:p>
     <w:p>
       <w:pPr>
-        <w:pStyle w:val="ListNumber"/>
+        <w:ind w:left="360"/>
       </w:pPr>
       <w:r>
-        <w:t>12-month cliff (25% retroactive), then monthly vesting over 36 months.</w:t>
+        <w:t xml:space="preserve">2. </w:t>
+      </w:r>
+      <w:r>
+        <w:rPr>
+          <w:b/>
+        </w:rPr>
+        <w:t>Cliff:</w:t>
+      </w:r>
+      <w:r>
+        <w:t xml:space="preserve"> no shares vest before the 12-month anniversary of the start date.</w:t>
+      </w:r>
+    </w:p>
+    <w:p>
+      <w:r>
+        <w:t>On passing the cliff, 25% vests retroactively; the remainder vests monthly</w:t>
+      </w:r>
+    </w:p>
+    <w:p>
+      <w:r>
+        <w:t>over the following 36 months.</w:t>
       </w:r>
     </w:p>
     <w:p>
       <w:pPr>
-        <w:pStyle w:val="ListNumber"/>
+        <w:ind w:left="360"/>
       </w:pPr>
       <w:r>
-        <w:t>Good leaver / bad leaver provisions per the shareholders' agreement;</w:t>
-      </w:r>
-    </w:p>
-    <w:p>
-      <w:r>
-        <w:t>unvested shares cancel on departure.</w:t>
+        <w:t xml:space="preserve">3. </w:t>
+      </w:r>
+      <w:r>
+        <w:rPr>
+          <w:b/>
+        </w:rPr>
+        <w:t>Leavers:</w:t>
       </w:r>
     </w:p>
     <w:p>
       <w:pPr>
-        <w:pStyle w:val="ListNumber"/>
+        <w:pStyle w:val="ListBullet2"/>
       </w:pPr>
       <w:r>
-        <w:t>No single-trigger acceleration; double-trigger = 50% acceleration of unvested shares.</w:t>
+        <w:rPr>
+          <w:b/>
+        </w:rPr>
+        <w:t>Good leaver</w:t>
+      </w:r>
+      <w:r>
+        <w:t xml:space="preserve"> — by default, every departure that is not a bad leaver is</w:t>
+      </w:r>
+      <w:r>
+        <w:br/>
+      </w:r>
+      <w:r>
+        <w:t>treated as a good leaver. Explicit examples: death or serious illness,</w:t>
+      </w:r>
+      <w:r>
+        <w:br/>
+      </w:r>
+      <w:r>
+        <w:t>mutual agreement, role eliminated, resignation for good reason (material</w:t>
+      </w:r>
+      <w:r>
+        <w:br/>
+      </w:r>
+      <w:r>
+        <w:t>reduction in agreed role/commitment, unpaid equity terms, or a change the</w:t>
+      </w:r>
+      <w:r>
+        <w:br/>
+      </w:r>
+      <w:r>
+        <w:t>founder did not consent to). Treatment: vested shares retained; unvested</w:t>
+      </w:r>
+      <w:r>
+        <w:br/>
+      </w:r>
+      <w:r>
+        <w:t>cancelled or partly accelerated at board discretion.</w:t>
       </w:r>
     </w:p>
     <w:p>
       <w:pPr>
-        <w:pStyle w:val="ListNumber"/>
+        <w:pStyle w:val="ListBullet2"/>
       </w:pPr>
       <w:r>
-        <w:t>Pro-rata dilution in future rounds; option-pool changes require unanimous founder consent.</w:t>
+        <w:rPr>
+          <w:b/>
+        </w:rPr>
+        <w:t>Bad leaver</w:t>
+      </w:r>
+      <w:r>
+        <w:t xml:space="preserve"> — only the following, determined by majority of the</w:t>
+      </w:r>
+      <w:r>
+        <w:br/>
+      </w:r>
+      <w:r>
+        <w:t>non-affected founders (or the board where independent):</w:t>
       </w:r>
     </w:p>
     <w:p>
       <w:pPr>
-        <w:pStyle w:val="ListNumber"/>
+        <w:ind w:left="864"/>
       </w:pPr>
       <w:r>
-        <w:t>Founder share transfers restricted by pre-emption rights in the shareholders' agreement.</w:t>
+        <w:t>(a) gross misconduct or fraud;</w:t>
+      </w:r>
+    </w:p>
+    <w:p>
+      <w:pPr>
+        <w:ind w:left="864"/>
+      </w:pPr>
+      <w:r>
+        <w:t>(b) conviction of an offence involving dishonesty;</w:t>
+      </w:r>
+    </w:p>
+    <w:p>
+      <w:pPr>
+        <w:ind w:left="864"/>
+      </w:pPr>
+      <w:r>
+        <w:t>(c) material breach of this agreement or the shareholders' agreement</w:t>
+      </w:r>
+    </w:p>
+    <w:p>
+      <w:r>
+        <w:t>(including concealment of a known, material interest declared under</w:t>
+      </w:r>
+    </w:p>
+    <w:p>
+      <w:r>
+        <w:t>clause 7, or breach of confidentiality/IP assignment);</w:t>
+      </w:r>
+    </w:p>
+    <w:p>
+      <w:pPr>
+        <w:ind w:left="864"/>
+      </w:pPr>
+      <w:r>
+        <w:t xml:space="preserve">(d) resignation </w:t>
+      </w:r>
+      <w:r>
+        <w:rPr>
+          <w:b/>
+        </w:rPr>
+        <w:t>without good reason</w:t>
+      </w:r>
+      <w:r>
+        <w:t xml:space="preserve"> within the first 24 months after</w:t>
+      </w:r>
+    </w:p>
+    <w:p>
+      <w:r>
+        <w:t>the cliff;</w:t>
+      </w:r>
+    </w:p>
+    <w:p>
+      <w:pPr>
+        <w:ind w:left="864"/>
+      </w:pPr>
+      <w:r>
+        <w:t>(e) persistent failure to meet the agreed commitment after written warning</w:t>
+      </w:r>
+    </w:p>
+    <w:p>
+      <w:r>
+        <w:t>and a 30-day cure period; or</w:t>
+      </w:r>
+    </w:p>
+    <w:p>
+      <w:pPr>
+        <w:ind w:left="864"/>
+      </w:pPr>
+      <w:r>
+        <w:t>(f) conduct that seriously damages the company's reputation or regulatory</w:t>
+      </w:r>
+    </w:p>
+    <w:p>
+      <w:r>
+        <w:t>standing.</w:t>
+      </w:r>
+    </w:p>
+    <w:p>
+      <w:r>
+        <w:t>Treatment: unvested shares cancel; vested shares are **bought back at fair</w:t>
+      </w:r>
+    </w:p>
+    <w:p>
+      <w:r>
+        <w:t>market value** — determined by an independent valuator jointly appointed by</w:t>
+      </w:r>
+    </w:p>
+    <w:p>
+      <w:r>
+        <w:t>the company and the leaver, or, if an arm's-length financing or valuation</w:t>
+      </w:r>
+    </w:p>
+    <w:p>
+      <w:r>
+        <w:t>occurred within the preceding 12 months, at that round's price per share.</w:t>
+      </w:r>
+    </w:p>
+    <w:p>
+      <w:r>
+        <w:t>Proceeds are payable within 60 days of the valuation. Anything not listed</w:t>
+      </w:r>
+    </w:p>
+    <w:p>
+      <w:r>
+        <w:t>above cannot be treated as bad-leaver conduct.</w:t>
+      </w:r>
+    </w:p>
+    <w:p>
+      <w:pPr>
+        <w:ind w:left="360"/>
+      </w:pPr>
+      <w:r>
+        <w:t xml:space="preserve">4. </w:t>
+      </w:r>
+      <w:r>
+        <w:rPr>
+          <w:b/>
+        </w:rPr>
+        <w:t>Acceleration:</w:t>
+      </w:r>
+      <w:r>
+        <w:t xml:space="preserve"> single-trigger acceleration is not offered; **double-trigger</w:t>
+      </w:r>
+    </w:p>
+    <w:p>
+      <w:r>
+        <w:t>(change of control + termination without cause, or resignation for good</w:t>
+      </w:r>
+    </w:p>
+    <w:p>
+      <w:r>
+        <w:t>reason following a change of control) accelerates 100% of unvested shares.**</w:t>
+      </w:r>
+    </w:p>
+    <w:p>
+      <w:r>
+        <w:t>A change of control alone does not accelerate anything.</w:t>
+      </w:r>
+    </w:p>
+    <w:p>
+      <w:pPr>
+        <w:ind w:left="360"/>
+      </w:pPr>
+      <w:r>
+        <w:t xml:space="preserve">5. </w:t>
+      </w:r>
+      <w:r>
+        <w:rPr>
+          <w:b/>
+        </w:rPr>
+        <w:t>Dilution:</w:t>
+      </w:r>
+      <w:r>
+        <w:t xml:space="preserve"> a </w:t>
+      </w:r>
+      <w:r>
+        <w:rPr>
+          <w:b/>
+        </w:rPr>
+        <w:t>20% unallocated reserve</w:t>
+      </w:r>
+      <w:r>
+        <w:t xml:space="preserve"> (future hires / option pool) is</w:t>
+      </w:r>
+    </w:p>
+    <w:p>
+      <w:r>
+        <w:t>created at incorporation, so future option grants are funded from the reserve</w:t>
+      </w:r>
+    </w:p>
+    <w:p>
+      <w:r>
+        <w:t>rather than by further diluting founders. Future investment rounds dilute all</w:t>
+      </w:r>
+    </w:p>
+    <w:p>
+      <w:r>
+        <w:t>holders pro rata. Any top-up of the pool beyond 20%, or any pool creation from</w:t>
+      </w:r>
+    </w:p>
+    <w:p>
+      <w:r>
+        <w:t>founder holdings, requires unanimous founder consent.</w:t>
+      </w:r>
+    </w:p>
+    <w:p>
+      <w:pPr>
+        <w:ind w:left="360"/>
+      </w:pPr>
+      <w:r>
+        <w:t xml:space="preserve">6. </w:t>
+      </w:r>
+      <w:r>
+        <w:rPr>
+          <w:b/>
+        </w:rPr>
+        <w:t>Lock-in:</w:t>
+      </w:r>
+      <w:r>
+        <w:t xml:space="preserve"> founders may not transfer shares other than per the shareholders'</w:t>
+      </w:r>
+    </w:p>
+    <w:p>
+      <w:r>
+        <w:t>agreement (pre-emption rights apply).</w:t>
       </w:r>
     </w:p>
     <w:sectPr>
       <w:pgSz w:w="12240" w:h="15840"/>
-      <w:pgMar w:top="1440" w:right="1296" w:bottom="1440" w:left="1296" w:header="720" w:footer="720" w:gutter="0"/>
+      <w:pgMar w:top="1440" w:right="1800" w:bottom="1440" w:left="1800" w:header="720" w:footer="720" w:gutter="0"/>
       <w:cols w:space="720"/>
       <w:docGrid w:linePitch="360"/>
     </w:sectPr>
@@ -1696,10 +2635,6 @@
     <w:name w:val="Normal"/>
     <w:qFormat/>
     <w:rsid w:val="00FC693F"/>
-    <w:rPr>
-      <w:rFonts w:ascii="Calibri" w:hAnsi="Calibri"/>
-      <w:sz w:val="21"/>
-    </w:rPr>
   </w:style>
   <w:style w:type="paragraph" w:styleId="Header">
     <w:name w:val="header"/>

</xml_diff>